<commit_message>
Adds roza-ud and support for the 5th column in the table
</commit_message>
<xml_diff>
--- a/certificate-name-input.docx
+++ b/certificate-name-input.docx
@@ -5,16 +5,17 @@
     <w:tbl>
       <w:tblPr>
         <w:tblStyle w:val="TableGrid"/>
-        <w:tblW w:w="10800" w:type="dxa"/>
+        <w:tblW w:w="12240" w:type="dxa"/>
         <w:tblInd w:w="-522" w:type="dxa"/>
         <w:tblLayout w:type="fixed"/>
         <w:tblLook w:val="04A0" w:firstRow="1" w:lastRow="0" w:firstColumn="1" w:lastColumn="0" w:noHBand="0" w:noVBand="1"/>
       </w:tblPr>
       <w:tblGrid>
         <w:gridCol w:w="1530"/>
-        <w:gridCol w:w="810"/>
-        <w:gridCol w:w="2520"/>
+        <w:gridCol w:w="1980"/>
+        <w:gridCol w:w="1350"/>
         <w:gridCol w:w="4500"/>
+        <w:gridCol w:w="1440"/>
         <w:gridCol w:w="1440"/>
       </w:tblGrid>
       <w:tr>
@@ -39,7 +40,7 @@
         </w:tc>
         <w:tc>
           <w:tcPr>
-            <w:tcW w:w="810" w:type="dxa"/>
+            <w:tcW w:w="1980" w:type="dxa"/>
             <w:tcBorders>
               <w:top w:val="single" w:sz="4" w:space="0" w:color="auto"/>
               <w:left w:val="single" w:sz="4" w:space="0" w:color="auto"/>
@@ -55,7 +56,7 @@
         </w:tc>
         <w:tc>
           <w:tcPr>
-            <w:tcW w:w="2520" w:type="dxa"/>
+            <w:tcW w:w="1350" w:type="dxa"/>
             <w:tcBorders>
               <w:top w:val="single" w:sz="4" w:space="0" w:color="auto"/>
               <w:left w:val="single" w:sz="4" w:space="0" w:color="auto"/>
@@ -116,6 +117,21 @@
             </w:r>
           </w:p>
         </w:tc>
+        <w:tc>
+          <w:tcPr>
+            <w:tcW w:w="1440" w:type="dxa"/>
+          </w:tcPr>
+          <w:p>
+            <w:pPr>
+              <w:tabs>
+                <w:tab w:val="left" w:pos="2325"/>
+              </w:tabs>
+              <w:rPr>
+                <w:lang w:val="en-US"/>
+              </w:rPr>
+            </w:pPr>
+          </w:p>
+        </w:tc>
       </w:tr>
       <w:tr>
         <w:trPr>
@@ -132,14 +148,11 @@
             <w:r>
               <w:t>100.</w:t>
             </w:r>
-            <w:r>
-              <w:tab/>
-            </w:r>
-          </w:p>
-        </w:tc>
-        <w:tc>
-          <w:tcPr>
-            <w:tcW w:w="810" w:type="dxa"/>
+          </w:p>
+        </w:tc>
+        <w:tc>
+          <w:tcPr>
+            <w:tcW w:w="1980" w:type="dxa"/>
           </w:tcPr>
           <w:p>
             <w:r>
@@ -149,7 +162,7 @@
         </w:tc>
         <w:tc>
           <w:tcPr>
-            <w:tcW w:w="2520" w:type="dxa"/>
+            <w:tcW w:w="1350" w:type="dxa"/>
             <w:tcBorders>
               <w:top w:val="single" w:sz="4" w:space="0" w:color="auto"/>
               <w:left w:val="single" w:sz="4" w:space="0" w:color="auto"/>
@@ -191,6 +204,18 @@
             </w:r>
           </w:p>
         </w:tc>
+        <w:tc>
+          <w:tcPr>
+            <w:tcW w:w="1440" w:type="dxa"/>
+          </w:tcPr>
+          <w:p>
+            <w:pPr>
+              <w:rPr>
+                <w:lang w:val="en-US"/>
+              </w:rPr>
+            </w:pPr>
+          </w:p>
+        </w:tc>
       </w:tr>
       <w:tr>
         <w:trPr>
@@ -214,7 +239,7 @@
         </w:tc>
         <w:tc>
           <w:tcPr>
-            <w:tcW w:w="810" w:type="dxa"/>
+            <w:tcW w:w="1980" w:type="dxa"/>
           </w:tcPr>
           <w:p>
             <w:r>
@@ -224,7 +249,7 @@
         </w:tc>
         <w:tc>
           <w:tcPr>
-            <w:tcW w:w="2520" w:type="dxa"/>
+            <w:tcW w:w="1350" w:type="dxa"/>
             <w:tcBorders>
               <w:top w:val="single" w:sz="4" w:space="0" w:color="auto"/>
               <w:left w:val="single" w:sz="4" w:space="0" w:color="auto"/>
@@ -265,6 +290,18 @@
             </w:pPr>
           </w:p>
         </w:tc>
+        <w:tc>
+          <w:tcPr>
+            <w:tcW w:w="1440" w:type="dxa"/>
+          </w:tcPr>
+          <w:p>
+            <w:pPr>
+              <w:rPr>
+                <w:lang w:val="en-US"/>
+              </w:rPr>
+            </w:pPr>
+          </w:p>
+        </w:tc>
       </w:tr>
       <w:tr>
         <w:trPr>
@@ -288,7 +325,7 @@
         </w:tc>
         <w:tc>
           <w:tcPr>
-            <w:tcW w:w="810" w:type="dxa"/>
+            <w:tcW w:w="1980" w:type="dxa"/>
           </w:tcPr>
           <w:p>
             <w:r>
@@ -298,7 +335,7 @@
         </w:tc>
         <w:tc>
           <w:tcPr>
-            <w:tcW w:w="2520" w:type="dxa"/>
+            <w:tcW w:w="1350" w:type="dxa"/>
             <w:tcBorders>
               <w:top w:val="single" w:sz="4" w:space="0" w:color="auto"/>
               <w:left w:val="single" w:sz="4" w:space="0" w:color="auto"/>
@@ -340,6 +377,20 @@
             </w:pPr>
           </w:p>
         </w:tc>
+        <w:tc>
+          <w:tcPr>
+            <w:tcW w:w="1440" w:type="dxa"/>
+          </w:tcPr>
+          <w:p>
+            <w:pPr>
+              <w:jc w:val="both"/>
+              <w:outlineLvl w:val="1"/>
+              <w:rPr>
+                <w:lang w:val="en-US"/>
+              </w:rPr>
+            </w:pPr>
+          </w:p>
+        </w:tc>
       </w:tr>
       <w:tr>
         <w:trPr>
@@ -356,14 +407,11 @@
             <w:r>
               <w:t>103.</w:t>
             </w:r>
-            <w:r>
-              <w:tab/>
-            </w:r>
-          </w:p>
-        </w:tc>
-        <w:tc>
-          <w:tcPr>
-            <w:tcW w:w="810" w:type="dxa"/>
+          </w:p>
+        </w:tc>
+        <w:tc>
+          <w:tcPr>
+            <w:tcW w:w="1980" w:type="dxa"/>
           </w:tcPr>
           <w:p>
             <w:r>
@@ -373,7 +421,7 @@
         </w:tc>
         <w:tc>
           <w:tcPr>
-            <w:tcW w:w="2520" w:type="dxa"/>
+            <w:tcW w:w="1350" w:type="dxa"/>
             <w:tcBorders>
               <w:top w:val="single" w:sz="4" w:space="0" w:color="auto"/>
               <w:left w:val="single" w:sz="4" w:space="0" w:color="auto"/>
@@ -419,6 +467,18 @@
             </w:pPr>
           </w:p>
         </w:tc>
+        <w:tc>
+          <w:tcPr>
+            <w:tcW w:w="1440" w:type="dxa"/>
+          </w:tcPr>
+          <w:p>
+            <w:pPr>
+              <w:rPr>
+                <w:lang w:val="en-US"/>
+              </w:rPr>
+            </w:pPr>
+          </w:p>
+        </w:tc>
       </w:tr>
       <w:tr>
         <w:trPr>
@@ -431,18 +491,18 @@
           <w:p>
             <w:pPr>
               <w:ind w:left="502" w:hanging="360"/>
+              <w:rPr>
+                <w:lang w:val="en-US"/>
+              </w:rPr>
             </w:pPr>
             <w:r>
               <w:t>104.</w:t>
             </w:r>
-            <w:r>
-              <w:tab/>
-            </w:r>
-          </w:p>
-        </w:tc>
-        <w:tc>
-          <w:tcPr>
-            <w:tcW w:w="810" w:type="dxa"/>
+          </w:p>
+        </w:tc>
+        <w:tc>
+          <w:tcPr>
+            <w:tcW w:w="1980" w:type="dxa"/>
           </w:tcPr>
           <w:p>
             <w:r>
@@ -452,7 +512,7 @@
         </w:tc>
         <w:tc>
           <w:tcPr>
-            <w:tcW w:w="2520" w:type="dxa"/>
+            <w:tcW w:w="1350" w:type="dxa"/>
             <w:tcBorders>
               <w:top w:val="single" w:sz="4" w:space="0" w:color="auto"/>
               <w:left w:val="single" w:sz="4" w:space="0" w:color="auto"/>
@@ -493,6 +553,18 @@
             </w:pPr>
           </w:p>
         </w:tc>
+        <w:tc>
+          <w:tcPr>
+            <w:tcW w:w="1440" w:type="dxa"/>
+          </w:tcPr>
+          <w:p>
+            <w:pPr>
+              <w:rPr>
+                <w:lang w:val="en-US"/>
+              </w:rPr>
+            </w:pPr>
+          </w:p>
+        </w:tc>
       </w:tr>
       <w:tr>
         <w:trPr>
@@ -516,7 +588,7 @@
         </w:tc>
         <w:tc>
           <w:tcPr>
-            <w:tcW w:w="810" w:type="dxa"/>
+            <w:tcW w:w="1980" w:type="dxa"/>
           </w:tcPr>
           <w:p>
             <w:r>
@@ -526,7 +598,7 @@
         </w:tc>
         <w:tc>
           <w:tcPr>
-            <w:tcW w:w="2520" w:type="dxa"/>
+            <w:tcW w:w="1350" w:type="dxa"/>
             <w:tcBorders>
               <w:top w:val="single" w:sz="4" w:space="0" w:color="auto"/>
               <w:left w:val="single" w:sz="4" w:space="0" w:color="auto"/>
@@ -573,6 +645,18 @@
             </w:r>
           </w:p>
         </w:tc>
+        <w:tc>
+          <w:tcPr>
+            <w:tcW w:w="1440" w:type="dxa"/>
+          </w:tcPr>
+          <w:p>
+            <w:pPr>
+              <w:rPr>
+                <w:lang w:val="en-US"/>
+              </w:rPr>
+            </w:pPr>
+          </w:p>
+        </w:tc>
       </w:tr>
       <w:tr>
         <w:trPr>
@@ -596,7 +680,7 @@
         </w:tc>
         <w:tc>
           <w:tcPr>
-            <w:tcW w:w="810" w:type="dxa"/>
+            <w:tcW w:w="1980" w:type="dxa"/>
           </w:tcPr>
           <w:p>
             <w:r>
@@ -606,7 +690,7 @@
         </w:tc>
         <w:tc>
           <w:tcPr>
-            <w:tcW w:w="2520" w:type="dxa"/>
+            <w:tcW w:w="1350" w:type="dxa"/>
             <w:tcBorders>
               <w:top w:val="single" w:sz="4" w:space="0" w:color="auto"/>
               <w:left w:val="single" w:sz="4" w:space="0" w:color="auto"/>
@@ -648,6 +732,18 @@
             </w:r>
           </w:p>
         </w:tc>
+        <w:tc>
+          <w:tcPr>
+            <w:tcW w:w="1440" w:type="dxa"/>
+          </w:tcPr>
+          <w:p>
+            <w:pPr>
+              <w:rPr>
+                <w:lang w:val="en-US"/>
+              </w:rPr>
+            </w:pPr>
+          </w:p>
+        </w:tc>
       </w:tr>
       <w:tr>
         <w:trPr>
@@ -671,7 +767,7 @@
         </w:tc>
         <w:tc>
           <w:tcPr>
-            <w:tcW w:w="810" w:type="dxa"/>
+            <w:tcW w:w="1980" w:type="dxa"/>
           </w:tcPr>
           <w:p>
             <w:r>
@@ -681,7 +777,7 @@
         </w:tc>
         <w:tc>
           <w:tcPr>
-            <w:tcW w:w="2520" w:type="dxa"/>
+            <w:tcW w:w="1350" w:type="dxa"/>
             <w:tcBorders>
               <w:top w:val="single" w:sz="4" w:space="0" w:color="auto"/>
               <w:left w:val="single" w:sz="4" w:space="0" w:color="auto"/>
@@ -728,6 +824,18 @@
             </w:r>
           </w:p>
         </w:tc>
+        <w:tc>
+          <w:tcPr>
+            <w:tcW w:w="1440" w:type="dxa"/>
+          </w:tcPr>
+          <w:p>
+            <w:pPr>
+              <w:rPr>
+                <w:lang w:val="en-US"/>
+              </w:rPr>
+            </w:pPr>
+          </w:p>
+        </w:tc>
       </w:tr>
       <w:tr>
         <w:trPr>
@@ -751,7 +859,7 @@
         </w:tc>
         <w:tc>
           <w:tcPr>
-            <w:tcW w:w="810" w:type="dxa"/>
+            <w:tcW w:w="1980" w:type="dxa"/>
           </w:tcPr>
           <w:p>
             <w:r>
@@ -761,7 +869,7 @@
         </w:tc>
         <w:tc>
           <w:tcPr>
-            <w:tcW w:w="2520" w:type="dxa"/>
+            <w:tcW w:w="1350" w:type="dxa"/>
             <w:tcBorders>
               <w:top w:val="single" w:sz="4" w:space="0" w:color="auto"/>
               <w:left w:val="single" w:sz="4" w:space="0" w:color="auto"/>
@@ -813,6 +921,18 @@
             </w:r>
           </w:p>
         </w:tc>
+        <w:tc>
+          <w:tcPr>
+            <w:tcW w:w="1440" w:type="dxa"/>
+          </w:tcPr>
+          <w:p>
+            <w:pPr>
+              <w:rPr>
+                <w:lang w:val="en-US"/>
+              </w:rPr>
+            </w:pPr>
+          </w:p>
+        </w:tc>
       </w:tr>
       <w:tr>
         <w:trPr>
@@ -836,7 +956,7 @@
         </w:tc>
         <w:tc>
           <w:tcPr>
-            <w:tcW w:w="810" w:type="dxa"/>
+            <w:tcW w:w="1980" w:type="dxa"/>
           </w:tcPr>
           <w:p>
             <w:r>
@@ -846,7 +966,7 @@
         </w:tc>
         <w:tc>
           <w:tcPr>
-            <w:tcW w:w="2520" w:type="dxa"/>
+            <w:tcW w:w="1350" w:type="dxa"/>
             <w:tcBorders>
               <w:top w:val="single" w:sz="4" w:space="0" w:color="auto"/>
               <w:left w:val="single" w:sz="4" w:space="0" w:color="auto"/>
@@ -888,6 +1008,18 @@
             </w:r>
           </w:p>
         </w:tc>
+        <w:tc>
+          <w:tcPr>
+            <w:tcW w:w="1440" w:type="dxa"/>
+          </w:tcPr>
+          <w:p>
+            <w:pPr>
+              <w:rPr>
+                <w:lang w:val="en-US"/>
+              </w:rPr>
+            </w:pPr>
+          </w:p>
+        </w:tc>
       </w:tr>
       <w:tr>
         <w:trPr>
@@ -911,7 +1043,7 @@
         </w:tc>
         <w:tc>
           <w:tcPr>
-            <w:tcW w:w="810" w:type="dxa"/>
+            <w:tcW w:w="1980" w:type="dxa"/>
           </w:tcPr>
           <w:p>
             <w:pPr>
@@ -929,7 +1061,7 @@
         </w:tc>
         <w:tc>
           <w:tcPr>
-            <w:tcW w:w="2520" w:type="dxa"/>
+            <w:tcW w:w="1350" w:type="dxa"/>
             <w:tcBorders>
               <w:top w:val="single" w:sz="4" w:space="0" w:color="auto"/>
               <w:left w:val="single" w:sz="4" w:space="0" w:color="auto"/>
@@ -971,6 +1103,12 @@
             </w:r>
           </w:p>
         </w:tc>
+        <w:tc>
+          <w:tcPr>
+            <w:tcW w:w="1440" w:type="dxa"/>
+          </w:tcPr>
+          <w:p/>
+        </w:tc>
       </w:tr>
       <w:tr>
         <w:trPr>
@@ -991,7 +1129,7 @@
         </w:tc>
         <w:tc>
           <w:tcPr>
-            <w:tcW w:w="810" w:type="dxa"/>
+            <w:tcW w:w="1980" w:type="dxa"/>
           </w:tcPr>
           <w:p>
             <w:r>
@@ -1001,7 +1139,7 @@
         </w:tc>
         <w:tc>
           <w:tcPr>
-            <w:tcW w:w="2520" w:type="dxa"/>
+            <w:tcW w:w="1350" w:type="dxa"/>
             <w:tcBorders>
               <w:top w:val="single" w:sz="4" w:space="0" w:color="auto"/>
               <w:left w:val="single" w:sz="4" w:space="0" w:color="auto"/>
@@ -1034,6 +1172,12 @@
               <w:t>механик</w:t>
             </w:r>
           </w:p>
+        </w:tc>
+        <w:tc>
+          <w:tcPr>
+            <w:tcW w:w="1440" w:type="dxa"/>
+          </w:tcPr>
+          <w:p/>
         </w:tc>
       </w:tr>
     </w:tbl>

</xml_diff>

<commit_message>
cert_number cannot be an int
</commit_message>
<xml_diff>
--- a/certificate-name-input.docx
+++ b/certificate-name-input.docx
@@ -1298,12 +1298,113 @@
           </w:p>
         </w:tc>
       </w:tr>
+      <w:tr>
+        <w:trPr>
+          <w:trHeight w:val="284"/>
+        </w:trPr>
+        <w:tc>
+          <w:tcPr>
+            <w:tcW w:w="1530" w:type="dxa"/>
+            <w:vAlign w:val="center"/>
+          </w:tcPr>
+          <w:p>
+            <w:pPr>
+              <w:rPr>
+                <w:lang w:val="en-US"/>
+              </w:rPr>
+            </w:pPr>
+            <w:r>
+              <w:rPr>
+                <w:sz w:val="18"/>
+                <w:szCs w:val="18"/>
+              </w:rPr>
+              <w:t>RU1010507186625885</w:t>
+            </w:r>
+            <w:r>
+              <w:rPr>
+                <w:sz w:val="18"/>
+                <w:szCs w:val="18"/>
+              </w:rPr>
+              <w:t>01</w:t>
+            </w:r>
+          </w:p>
+        </w:tc>
+        <w:tc>
+          <w:tcPr>
+            <w:tcW w:w="1980" w:type="dxa"/>
+          </w:tcPr>
+          <w:p>
+            <w:pPr>
+              <w:rPr>
+                <w:lang w:val="en-US"/>
+              </w:rPr>
+            </w:pPr>
+          </w:p>
+        </w:tc>
+        <w:tc>
+          <w:tcPr>
+            <w:tcW w:w="1350" w:type="dxa"/>
+            <w:tcBorders>
+              <w:top w:val="single" w:sz="4" w:space="0" w:color="auto"/>
+              <w:left w:val="single" w:sz="4" w:space="0" w:color="auto"/>
+              <w:bottom w:val="single" w:sz="4" w:space="0" w:color="auto"/>
+              <w:right w:val="single" w:sz="4" w:space="0" w:color="auto"/>
+            </w:tcBorders>
+          </w:tcPr>
+          <w:p/>
+        </w:tc>
+        <w:tc>
+          <w:tcPr>
+            <w:tcW w:w="4500" w:type="dxa"/>
+            <w:vAlign w:val="center"/>
+          </w:tcPr>
+          <w:p>
+            <w:proofErr w:type="spellStart"/>
+            <w:r>
+              <w:rPr>
+                <w:bCs/>
+              </w:rPr>
+              <w:t>Ахиджаков</w:t>
+            </w:r>
+            <w:proofErr w:type="spellEnd"/>
+            <w:r>
+              <w:rPr>
+                <w:bCs/>
+              </w:rPr>
+              <w:t xml:space="preserve"> Адам </w:t>
+            </w:r>
+            <w:proofErr w:type="spellStart"/>
+            <w:r>
+              <w:rPr>
+                <w:bCs/>
+              </w:rPr>
+              <w:t>Пшимафович</w:t>
+            </w:r>
+            <w:proofErr w:type="spellEnd"/>
+          </w:p>
+        </w:tc>
+        <w:tc>
+          <w:tcPr>
+            <w:tcW w:w="1440" w:type="dxa"/>
+            <w:vAlign w:val="center"/>
+          </w:tcPr>
+          <w:p>
+            <w:r>
+              <w:rPr>
+                <w:color w:val="000000"/>
+              </w:rPr>
+              <w:t>Мастер производственного обучения</w:t>
+            </w:r>
+          </w:p>
+        </w:tc>
+        <w:tc>
+          <w:tcPr>
+            <w:tcW w:w="1440" w:type="dxa"/>
+          </w:tcPr>
+          <w:p/>
+        </w:tc>
+      </w:tr>
     </w:tbl>
-    <w:p>
-      <w:pPr>
-        <w:jc w:val="right"/>
-      </w:pPr>
-    </w:p>
     <w:p>
       <w:pPr>
         <w:jc w:val="right"/>
@@ -2106,6 +2207,92 @@
       <w:lvlJc w:val="right"/>
       <w:pPr>
         <w:ind w:left="6480" w:hanging="180"/>
+      </w:pPr>
+    </w:lvl>
+  </w:abstractNum>
+  <w:abstractNum w:abstractNumId="9" w15:restartNumberingAfterBreak="0">
+    <w:nsid w:val="6D774557"/>
+    <w:multiLevelType w:val="hybridMultilevel"/>
+    <w:tmpl w:val="97C62B1C"/>
+    <w:lvl w:ilvl="0" w:tplc="0419000F">
+      <w:start w:val="1"/>
+      <w:numFmt w:val="decimal"/>
+      <w:lvlText w:val="%1."/>
+      <w:lvlJc w:val="left"/>
+      <w:pPr>
+        <w:ind w:left="360" w:hanging="360"/>
+      </w:pPr>
+    </w:lvl>
+    <w:lvl w:ilvl="1" w:tplc="04190019" w:tentative="1">
+      <w:start w:val="1"/>
+      <w:numFmt w:val="lowerLetter"/>
+      <w:lvlText w:val="%2."/>
+      <w:lvlJc w:val="left"/>
+      <w:pPr>
+        <w:ind w:left="1080" w:hanging="360"/>
+      </w:pPr>
+    </w:lvl>
+    <w:lvl w:ilvl="2" w:tplc="0419001B" w:tentative="1">
+      <w:start w:val="1"/>
+      <w:numFmt w:val="lowerRoman"/>
+      <w:lvlText w:val="%3."/>
+      <w:lvlJc w:val="right"/>
+      <w:pPr>
+        <w:ind w:left="1800" w:hanging="180"/>
+      </w:pPr>
+    </w:lvl>
+    <w:lvl w:ilvl="3" w:tplc="0419000F" w:tentative="1">
+      <w:start w:val="1"/>
+      <w:numFmt w:val="decimal"/>
+      <w:lvlText w:val="%4."/>
+      <w:lvlJc w:val="left"/>
+      <w:pPr>
+        <w:ind w:left="2520" w:hanging="360"/>
+      </w:pPr>
+    </w:lvl>
+    <w:lvl w:ilvl="4" w:tplc="04190019" w:tentative="1">
+      <w:start w:val="1"/>
+      <w:numFmt w:val="lowerLetter"/>
+      <w:lvlText w:val="%5."/>
+      <w:lvlJc w:val="left"/>
+      <w:pPr>
+        <w:ind w:left="3240" w:hanging="360"/>
+      </w:pPr>
+    </w:lvl>
+    <w:lvl w:ilvl="5" w:tplc="0419001B" w:tentative="1">
+      <w:start w:val="1"/>
+      <w:numFmt w:val="lowerRoman"/>
+      <w:lvlText w:val="%6."/>
+      <w:lvlJc w:val="right"/>
+      <w:pPr>
+        <w:ind w:left="3960" w:hanging="180"/>
+      </w:pPr>
+    </w:lvl>
+    <w:lvl w:ilvl="6" w:tplc="0419000F" w:tentative="1">
+      <w:start w:val="1"/>
+      <w:numFmt w:val="decimal"/>
+      <w:lvlText w:val="%7."/>
+      <w:lvlJc w:val="left"/>
+      <w:pPr>
+        <w:ind w:left="4680" w:hanging="360"/>
+      </w:pPr>
+    </w:lvl>
+    <w:lvl w:ilvl="7" w:tplc="04190019" w:tentative="1">
+      <w:start w:val="1"/>
+      <w:numFmt w:val="lowerLetter"/>
+      <w:lvlText w:val="%8."/>
+      <w:lvlJc w:val="left"/>
+      <w:pPr>
+        <w:ind w:left="5400" w:hanging="360"/>
+      </w:pPr>
+    </w:lvl>
+    <w:lvl w:ilvl="8" w:tplc="0419001B" w:tentative="1">
+      <w:start w:val="1"/>
+      <w:numFmt w:val="lowerRoman"/>
+      <w:lvlText w:val="%9."/>
+      <w:lvlJc w:val="right"/>
+      <w:pPr>
+        <w:ind w:left="6120" w:hanging="180"/>
       </w:pPr>
     </w:lvl>
   </w:abstractNum>
@@ -2135,6 +2322,9 @@
   </w:num>
   <w:num w:numId="9" w16cid:durableId="341204089">
     <w:abstractNumId w:val="4"/>
+  </w:num>
+  <w:num w:numId="10" w16cid:durableId="184640798">
+    <w:abstractNumId w:val="9"/>
   </w:num>
 </w:numbering>
 </file>
@@ -2311,7 +2501,7 @@
     <w:lsdException w:name="Table Web 2" w:semiHidden="1" w:unhideWhenUsed="1"/>
     <w:lsdException w:name="Table Web 3" w:semiHidden="1" w:unhideWhenUsed="1"/>
     <w:lsdException w:name="Balloon Text" w:semiHidden="1" w:unhideWhenUsed="1"/>
-    <w:lsdException w:name="Table Grid" w:uiPriority="39"/>
+    <w:lsdException w:name="Table Grid" w:uiPriority="59"/>
     <w:lsdException w:name="Table Theme" w:semiHidden="1" w:unhideWhenUsed="1"/>
     <w:lsdException w:name="Placeholder Text" w:semiHidden="1"/>
     <w:lsdException w:name="No Spacing" w:uiPriority="1" w:qFormat="1"/>
@@ -2784,7 +2974,7 @@
   <w:style w:type="table" w:styleId="TableGrid">
     <w:name w:val="Table Grid"/>
     <w:basedOn w:val="TableNormal"/>
-    <w:uiPriority w:val="39"/>
+    <w:uiPriority w:val="59"/>
     <w:rsid w:val="00F14059"/>
     <w:pPr>
       <w:spacing w:after="0" w:line="240" w:lineRule="auto"/>
@@ -2882,6 +3072,19 @@
     </w:pPr>
     <w:rPr>
       <w:kern w:val="3"/>
+    </w:rPr>
+  </w:style>
+  <w:style w:type="paragraph" w:customStyle="1" w:styleId="ConsPlusNormal">
+    <w:name w:val="ConsPlusNormal"/>
+    <w:rsid w:val="00F265E4"/>
+    <w:pPr>
+      <w:suppressAutoHyphens/>
+      <w:spacing w:after="0" w:line="240" w:lineRule="auto"/>
+    </w:pPr>
+    <w:rPr>
+      <w:rFonts w:ascii="Arial" w:eastAsia="Arial" w:hAnsi="Arial" w:cs="Courier New"/>
+      <w:sz w:val="16"/>
+      <w:szCs w:val="24"/>
     </w:rPr>
   </w:style>
 </w:styles>

</xml_diff>

<commit_message>
Adding new certificate for Roza
</commit_message>
<xml_diff>
--- a/certificate-name-input.docx
+++ b/certificate-name-input.docx
@@ -232,9 +232,6 @@
             <w:r>
               <w:t>101.</w:t>
             </w:r>
-            <w:r>
-              <w:tab/>
-            </w:r>
           </w:p>
         </w:tc>
         <w:tc>
@@ -318,9 +315,6 @@
             <w:r>
               <w:t>102.</w:t>
             </w:r>
-            <w:r>
-              <w:tab/>
-            </w:r>
           </w:p>
         </w:tc>
         <w:tc>
@@ -581,9 +575,6 @@
             <w:r>
               <w:t>105.</w:t>
             </w:r>
-            <w:r>
-              <w:tab/>
-            </w:r>
           </w:p>
         </w:tc>
         <w:tc>
@@ -679,9 +670,6 @@
             <w:r>
               <w:t>106.</w:t>
             </w:r>
-            <w:r>
-              <w:tab/>
-            </w:r>
           </w:p>
         </w:tc>
         <w:tc>
@@ -772,9 +760,6 @@
             <w:r>
               <w:t>107.</w:t>
             </w:r>
-            <w:r>
-              <w:tab/>
-            </w:r>
           </w:p>
         </w:tc>
         <w:tc>
@@ -870,9 +855,6 @@
             <w:r>
               <w:t>108.</w:t>
             </w:r>
-            <w:r>
-              <w:tab/>
-            </w:r>
           </w:p>
         </w:tc>
         <w:tc>
@@ -973,9 +955,6 @@
             <w:r>
               <w:t>109.</w:t>
             </w:r>
-            <w:r>
-              <w:tab/>
-            </w:r>
           </w:p>
         </w:tc>
         <w:tc>
@@ -1059,9 +1038,6 @@
             </w:pPr>
             <w:r>
               <w:t>110.</w:t>
-            </w:r>
-            <w:r>
-              <w:tab/>
             </w:r>
           </w:p>
         </w:tc>

</xml_diff>